<commit_message>
revisi bimbingan pertama, +3 role dan perbaiki workflow (📅 10/04/2026 08:37:39)
</commit_message>
<xml_diff>
--- a/docs/AndhikaAP_KonsepTA_TugasPJJ.docx
+++ b/docs/AndhikaAP_KonsepTA_TugasPJJ.docx
@@ -1283,6 +1283,61 @@
           <w:noProof/>
         </w:rPr>
       </w:pPr>
+      <w:r>
+        <w:rPr>
+          <w:rFonts w:ascii="Times New Roman" w:hAnsi="Times New Roman" w:cs="Times New Roman"/>
+          <w:noProof/>
+        </w:rPr>
+        <w:drawing>
+          <wp:anchor distT="0" distB="0" distL="114300" distR="114300" simplePos="0" relativeHeight="251659264" behindDoc="0" locked="0" layoutInCell="1" allowOverlap="1" wp14:anchorId="5ACF5A91" wp14:editId="2618D961">
+            <wp:simplePos x="0" y="0"/>
+            <wp:positionH relativeFrom="column">
+              <wp:posOffset>0</wp:posOffset>
+            </wp:positionH>
+            <wp:positionV relativeFrom="paragraph">
+              <wp:posOffset>299720</wp:posOffset>
+            </wp:positionV>
+            <wp:extent cx="5731510" cy="3157855"/>
+            <wp:effectExtent l="0" t="0" r="2540" b="4445"/>
+            <wp:wrapTopAndBottom/>
+            <wp:docPr id="1463233323" name="Gambar 1"/>
+            <wp:cNvGraphicFramePr>
+              <a:graphicFrameLocks xmlns:a="http://schemas.openxmlformats.org/drawingml/2006/main" noChangeAspect="1"/>
+            </wp:cNvGraphicFramePr>
+            <a:graphic xmlns:a="http://schemas.openxmlformats.org/drawingml/2006/main">
+              <a:graphicData uri="http://schemas.openxmlformats.org/drawingml/2006/picture">
+                <pic:pic xmlns:pic="http://schemas.openxmlformats.org/drawingml/2006/picture">
+                  <pic:nvPicPr>
+                    <pic:cNvPr id="1463233323" name="Gambar 1463233323"/>
+                    <pic:cNvPicPr/>
+                  </pic:nvPicPr>
+                  <pic:blipFill>
+                    <a:blip r:embed="rId7">
+                      <a:extLst>
+                        <a:ext uri="{28A0092B-C50C-407E-A947-70E740481C1C}">
+                          <a14:useLocalDpi xmlns:a14="http://schemas.microsoft.com/office/drawing/2010/main" val="0"/>
+                        </a:ext>
+                      </a:extLst>
+                    </a:blip>
+                    <a:stretch>
+                      <a:fillRect/>
+                    </a:stretch>
+                  </pic:blipFill>
+                  <pic:spPr>
+                    <a:xfrm>
+                      <a:off x="0" y="0"/>
+                      <a:ext cx="5731510" cy="3157855"/>
+                    </a:xfrm>
+                    <a:prstGeom prst="rect">
+                      <a:avLst/>
+                    </a:prstGeom>
+                  </pic:spPr>
+                </pic:pic>
+              </a:graphicData>
+            </a:graphic>
+          </wp:anchor>
+        </w:drawing>
+      </w:r>
     </w:p>
     <w:p>
       <w:pPr>
@@ -1583,6 +1638,7 @@
                 <w:rFonts w:ascii="Times New Roman" w:hAnsi="Times New Roman" w:cs="Times New Roman"/>
                 <w:noProof/>
               </w:rPr>
+              <w:lastRenderedPageBreak/>
               <w:t>2</w:t>
             </w:r>
           </w:p>
@@ -2111,7 +2167,6 @@
                 <w:rFonts w:ascii="Times New Roman" w:hAnsi="Times New Roman" w:cs="Times New Roman"/>
                 <w:noProof/>
               </w:rPr>
-              <w:lastRenderedPageBreak/>
               <w:t>7</w:t>
             </w:r>
           </w:p>
@@ -2939,6 +2994,7 @@
                 <w:rFonts w:ascii="Times New Roman" w:hAnsi="Times New Roman" w:cs="Times New Roman"/>
                 <w:noProof/>
               </w:rPr>
+              <w:lastRenderedPageBreak/>
               <w:t>4</w:t>
             </w:r>
           </w:p>
@@ -3615,7 +3671,6 @@
           <w:rFonts w:ascii="Times New Roman" w:hAnsi="Times New Roman" w:cs="Times New Roman"/>
           <w:noProof/>
         </w:rPr>
-        <w:lastRenderedPageBreak/>
         <w:t>Sistem Poin Pelanggaran:</w:t>
       </w:r>
     </w:p>
@@ -3891,6 +3946,7 @@
                 <w:bCs/>
                 <w:noProof/>
               </w:rPr>
+              <w:lastRenderedPageBreak/>
               <w:t>No</w:t>
             </w:r>
           </w:p>
@@ -5270,7 +5326,6 @@
                 <w:rFonts w:ascii="Times New Roman" w:hAnsi="Times New Roman" w:cs="Times New Roman"/>
                 <w:noProof/>
               </w:rPr>
-              <w:lastRenderedPageBreak/>
               <w:t>13</w:t>
             </w:r>
           </w:p>
@@ -6945,7 +7000,6 @@
           <w:rFonts w:ascii="Times New Roman" w:hAnsi="Times New Roman" w:cs="Times New Roman"/>
           <w:noProof/>
         </w:rPr>
-        <w:lastRenderedPageBreak/>
         <w:t>· Pelanggaran Saya</w:t>
       </w:r>
     </w:p>
@@ -7224,6 +7278,7 @@
           <w:bCs/>
           <w:noProof/>
         </w:rPr>
+        <w:lastRenderedPageBreak/>
         <w:t>Aplikasi Bimbingan dan Konseling Online ini berhasil mengdigitalisasi layanan BK di SMK Negeri 2 Cimahi dengan fitur-fitur utama:</w:t>
       </w:r>
     </w:p>

</xml_diff>